<commit_message>
CS1102 Unit 2: Deep rewrite — comprehensive notes from Eck 3.3/3.4/3.7, discussion grounded in textbook, assignment with full design justification
</commit_message>
<xml_diff>
--- a/CS1102_Programming_1/Unit2_Control_Structures/Discussion/Unit2_Discussion_Assignment.docx
+++ b/CS1102_Programming_1/Unit2_Control_Structures/Discussion/Unit2_Discussion_Assignment.docx
@@ -114,7 +114,7 @@
           <w:rFonts w:ascii="Times New Roman" w:hAnsi="Times New Roman"/>
           <w:sz w:val="24"/>
         </w:rPr>
-        <w:t xml:space="preserve">Java provides three looping control structures, each suited to different programming scenarios. Understanding their nuances is essential for writing efficient, readable code.</w:t>
+        <w:t xml:space="preserve">Java provides three looping control structures, each designed for a different programming scenario. Understanding their nuances — not just their syntax but their behavioral differences — is essential for writing correct, readable programs.</w:t>
       </w:r>
     </w:p>
     <w:p>
@@ -157,7 +157,7 @@
           <w:rFonts w:ascii="Times New Roman" w:hAnsi="Times New Roman"/>
           <w:sz w:val="24"/>
         </w:rPr>
-        <w:t xml:space="preserve">loop tests its continuation condition before executing the body, meaning the body may execute zero times if the condition is false from the start (Eck, 2022, Section 3.3.1). This makes it the right choice when the number of iterations is unknown and the loop may legitimately need to be skipped entirely. A practical example is reading user input until a sentinel value is entered — if the user immediately enters the sentinel, the loop body never runs, which is the correct behavior.</w:t>
+        <w:t xml:space="preserve">loop tests its continuation condition before executing the body. This means the body may execute zero times if the condition is false from the very start. Eck (2022) illustrates this with the sentinel value pattern: a program that reads positive integers until the user enters zero must read the first integer before the loop begins — a technique called priming the loop — so that the condition is meaningful on the first evaluation (Section 3.3.1). If the user immediately enters zero, the loop body never runs, which is the correct behavior. A critical subtlety is that even if the condition becomes false in the middle of the loop body, the loop does not stop immediately — the computer finishes the entire body before jumping back to check the condition again (Eck, 2022, Section 3.3.1).</w:t>
       </w:r>
     </w:p>
     <w:p>
@@ -200,7 +200,36 @@
           <w:rFonts w:ascii="Times New Roman" w:hAnsi="Times New Roman"/>
           <w:sz w:val="24"/>
         </w:rPr>
-        <w:t xml:space="preserve">loop moves the condition test to the end, guaranteeing the body executes at least once (Eck, 2022, Section 3.3.2). This is the natural choice for menus, input validation prompts, and game loops — situations where the action must occur before it makes sense to ask whether to continue. For instance, a menu must be displayed before the user can choose to exit. Using a while loop here would require duplicating the display code before the loop, which violates the DRY (Don’t Repeat Yourself) principle.</w:t>
+        <w:t xml:space="preserve">loop moves the condition test to the end, guaranteeing the body executes at least once. Eck (2022) uses a game-playing example to show why this matters: a game must be played before the user can be asked whether to play again, so testing the condition first would require duplicating the game-playing code before the loop (Section 3.3.2). The do-while eliminates this redundancy. The boolean variable used to store the user’s response is an example of a flag variable — a signal set in one part of the program and tested in another. One syntax detail that causes errors: the semicolon after the closing</w:t>
+      </w:r>
+      <w:r>
+        <w:rPr>
+          <w:rFonts w:ascii="Times New Roman" w:hAnsi="Times New Roman"/>
+          <w:sz w:val="24"/>
+        </w:rPr>
+        <w:t xml:space="preserve"> </w:t>
+      </w:r>
+      <w:r>
+        <w:rPr>
+          <w:rStyle w:val="VerbatimChar"/>
+          <w:rFonts w:ascii="Times New Roman" w:hAnsi="Times New Roman"/>
+          <w:sz w:val="24"/>
+        </w:rPr>
+        <w:t xml:space="preserve">while (condition)</w:t>
+      </w:r>
+      <w:r>
+        <w:rPr>
+          <w:rFonts w:ascii="Times New Roman" w:hAnsi="Times New Roman"/>
+          <w:sz w:val="24"/>
+        </w:rPr>
+        <w:t xml:space="preserve"> </w:t>
+      </w:r>
+      <w:r>
+        <w:rPr>
+          <w:rFonts w:ascii="Times New Roman" w:hAnsi="Times New Roman"/>
+          <w:sz w:val="24"/>
+        </w:rPr>
+        <w:t xml:space="preserve">is required and its omission is a syntax error (Eck, 2022, Section 3.3.2).</w:t>
       </w:r>
     </w:p>
     <w:p>
@@ -243,7 +272,65 @@
           <w:rFonts w:ascii="Times New Roman" w:hAnsi="Times New Roman"/>
           <w:sz w:val="24"/>
         </w:rPr>
-        <w:t xml:space="preserve">loop consolidates initialization, condition, and update into a single line, making it the most readable structure for counted iteration (Eck, 2022, Section 3.4). Traversing an array, printing a multiplication table, or repeating an action a fixed number of times are all natural fits. Eck (2022) observes that for loops likely outnumber while loops in real programs precisely because keeping all loop control in one place reduces cognitive load for the reader (Section 3.4).</w:t>
+        <w:t xml:space="preserve">loop consolidates initialization, condition, and update into a single line. Eck (2022) explains that any for loop is equivalent to a while loop — the language gains no new power — but for a certain class of problems, particularly counted iteration, the for loop is easier to construct and easier to read because all loop control stays in one place (Section 3.4). The most common form is the counting loop, where a loop control variable takes on every integer value between a minimum and maximum. A frequent source of bugs is using</w:t>
+      </w:r>
+      <w:r>
+        <w:rPr>
+          <w:rFonts w:ascii="Times New Roman" w:hAnsi="Times New Roman"/>
+          <w:sz w:val="24"/>
+        </w:rPr>
+        <w:t xml:space="preserve"> </w:t>
+      </w:r>
+      <w:r>
+        <w:rPr>
+          <w:rStyle w:val="VerbatimChar"/>
+          <w:rFonts w:ascii="Times New Roman" w:hAnsi="Times New Roman"/>
+          <w:sz w:val="24"/>
+        </w:rPr>
+        <w:t xml:space="preserve">&lt;</w:t>
+      </w:r>
+      <w:r>
+        <w:rPr>
+          <w:rFonts w:ascii="Times New Roman" w:hAnsi="Times New Roman"/>
+          <w:sz w:val="24"/>
+        </w:rPr>
+        <w:t xml:space="preserve"> </w:t>
+      </w:r>
+      <w:r>
+        <w:rPr>
+          <w:rFonts w:ascii="Times New Roman" w:hAnsi="Times New Roman"/>
+          <w:sz w:val="24"/>
+        </w:rPr>
+        <w:t xml:space="preserve">when</w:t>
+      </w:r>
+      <w:r>
+        <w:rPr>
+          <w:rFonts w:ascii="Times New Roman" w:hAnsi="Times New Roman"/>
+          <w:sz w:val="24"/>
+        </w:rPr>
+        <w:t xml:space="preserve"> </w:t>
+      </w:r>
+      <w:r>
+        <w:rPr>
+          <w:rStyle w:val="VerbatimChar"/>
+          <w:rFonts w:ascii="Times New Roman" w:hAnsi="Times New Roman"/>
+          <w:sz w:val="24"/>
+        </w:rPr>
+        <w:t xml:space="preserve">&lt;=</w:t>
+      </w:r>
+      <w:r>
+        <w:rPr>
+          <w:rFonts w:ascii="Times New Roman" w:hAnsi="Times New Roman"/>
+          <w:sz w:val="24"/>
+        </w:rPr>
+        <w:t xml:space="preserve"> </w:t>
+      </w:r>
+      <w:r>
+        <w:rPr>
+          <w:rFonts w:ascii="Times New Roman" w:hAnsi="Times New Roman"/>
+          <w:sz w:val="24"/>
+        </w:rPr>
+        <w:t xml:space="preserve">is needed, or vice versa — what Eck (2022) calls an off-by-one error (Section 3.4.1).</w:t>
       </w:r>
     </w:p>
     <w:p>
@@ -256,7 +343,94 @@
           <w:rFonts w:ascii="Times New Roman" w:hAnsi="Times New Roman"/>
           <w:sz w:val="24"/>
         </w:rPr>
-        <w:t xml:space="preserve">The key trade-off is between flexibility and clarity. The while loop is the most general — any for or do-while loop can be rewritten as a while loop — but the for loop’s compact syntax wins on readability for counted iteration, and the do-while’s guaranteed first execution eliminates redundant code in menu-driven programs. Choosing the right loop structure is not just a stylistic preference; it communicates intent to anyone reading the code.</w:t>
+        <w:t xml:space="preserve">The selection criterion is clear: use</w:t>
+      </w:r>
+      <w:r>
+        <w:rPr>
+          <w:rFonts w:ascii="Times New Roman" w:hAnsi="Times New Roman"/>
+          <w:sz w:val="24"/>
+        </w:rPr>
+        <w:t xml:space="preserve"> </w:t>
+      </w:r>
+      <w:r>
+        <w:rPr>
+          <w:rStyle w:val="VerbatimChar"/>
+          <w:rFonts w:ascii="Times New Roman" w:hAnsi="Times New Roman"/>
+          <w:sz w:val="24"/>
+        </w:rPr>
+        <w:t xml:space="preserve">for</w:t>
+      </w:r>
+      <w:r>
+        <w:rPr>
+          <w:rFonts w:ascii="Times New Roman" w:hAnsi="Times New Roman"/>
+          <w:sz w:val="24"/>
+        </w:rPr>
+        <w:t xml:space="preserve"> </w:t>
+      </w:r>
+      <w:r>
+        <w:rPr>
+          <w:rFonts w:ascii="Times New Roman" w:hAnsi="Times New Roman"/>
+          <w:sz w:val="24"/>
+        </w:rPr>
+        <w:t xml:space="preserve">when the number of iterations is known in advance; use</w:t>
+      </w:r>
+      <w:r>
+        <w:rPr>
+          <w:rFonts w:ascii="Times New Roman" w:hAnsi="Times New Roman"/>
+          <w:sz w:val="24"/>
+        </w:rPr>
+        <w:t xml:space="preserve"> </w:t>
+      </w:r>
+      <w:r>
+        <w:rPr>
+          <w:rStyle w:val="VerbatimChar"/>
+          <w:rFonts w:ascii="Times New Roman" w:hAnsi="Times New Roman"/>
+          <w:sz w:val="24"/>
+        </w:rPr>
+        <w:t xml:space="preserve">while</w:t>
+      </w:r>
+      <w:r>
+        <w:rPr>
+          <w:rFonts w:ascii="Times New Roman" w:hAnsi="Times New Roman"/>
+          <w:sz w:val="24"/>
+        </w:rPr>
+        <w:t xml:space="preserve"> </w:t>
+      </w:r>
+      <w:r>
+        <w:rPr>
+          <w:rFonts w:ascii="Times New Roman" w:hAnsi="Times New Roman"/>
+          <w:sz w:val="24"/>
+        </w:rPr>
+        <w:t xml:space="preserve">when the number is unknown and the body may need to be skipped entirely; use</w:t>
+      </w:r>
+      <w:r>
+        <w:rPr>
+          <w:rFonts w:ascii="Times New Roman" w:hAnsi="Times New Roman"/>
+          <w:sz w:val="24"/>
+        </w:rPr>
+        <w:t xml:space="preserve"> </w:t>
+      </w:r>
+      <w:r>
+        <w:rPr>
+          <w:rStyle w:val="VerbatimChar"/>
+          <w:rFonts w:ascii="Times New Roman" w:hAnsi="Times New Roman"/>
+          <w:sz w:val="24"/>
+        </w:rPr>
+        <w:t xml:space="preserve">do-while</w:t>
+      </w:r>
+      <w:r>
+        <w:rPr>
+          <w:rFonts w:ascii="Times New Roman" w:hAnsi="Times New Roman"/>
+          <w:sz w:val="24"/>
+        </w:rPr>
+        <w:t xml:space="preserve"> </w:t>
+      </w:r>
+      <w:r>
+        <w:rPr>
+          <w:rFonts w:ascii="Times New Roman" w:hAnsi="Times New Roman"/>
+          <w:sz w:val="24"/>
+        </w:rPr>
+        <w:t xml:space="preserve">when the body must execute at least once before the condition is meaningful.</w:t>
       </w:r>
     </w:p>
     <w:p>
@@ -271,7 +445,7 @@
           <w:bCs/>
           <w:sz w:val="24"/>
         </w:rPr>
-        <w:t xml:space="preserve">Word count: 320</w:t>
+        <w:t xml:space="preserve">Word count: 390</w:t>
       </w:r>
     </w:p>
     <w:p>
@@ -313,7 +487,7 @@
           <w:rFonts w:ascii="Times New Roman" w:hAnsi="Times New Roman"/>
           <w:sz w:val="24"/>
         </w:rPr>
-        <w:t xml:space="preserve">Both if-else and switch statements implement conditional branching, but they differ significantly in syntax, performance, readability, and appropriate use cases.</w:t>
+        <w:t xml:space="preserve">Both if-else and switch implement conditional branching, but they differ in what conditions they can express, how the compiler handles them, and when each produces cleaner code.</w:t>
       </w:r>
     </w:p>
     <w:p>
@@ -356,7 +530,7 @@
           <w:rFonts w:ascii="Times New Roman" w:hAnsi="Times New Roman"/>
           <w:sz w:val="24"/>
         </w:rPr>
-        <w:t xml:space="preserve">statement is the most general conditional tool in Java. It evaluates any boolean expression, handles range conditions, compound logic, and multiple variables simultaneously. For example,</w:t>
+        <w:t xml:space="preserve">statement evaluates any boolean expression. It handles range conditions, compound logic involving multiple variables, and any combination of relational and logical operators. For example,</w:t>
       </w:r>
       <w:r>
         <w:rPr>
@@ -385,7 +559,7 @@
           <w:rFonts w:ascii="Times New Roman" w:hAnsi="Times New Roman"/>
           <w:sz w:val="24"/>
         </w:rPr>
-        <w:t xml:space="preserve">tests two variables with a range condition — something switch cannot do. Its strength is flexibility; its limitation is verbosity when testing a single variable against many fixed values, since each branch repeats the variable name and comparison operator (Eck, 2022, Section 3.5).</w:t>
+        <w:t xml:space="preserve">tests two variables with a range condition — something a switch statement fundamentally cannot do. Eck (2022) describes if-else as the most general conditional tool, capable of expressing any branching logic (Section 3.5). Its limitation is verbosity: when testing a single variable against many fixed values, each branch repeats the variable name and comparison operator, making the code harder to scan.</w:t>
       </w:r>
     </w:p>
     <w:p>
@@ -428,7 +602,7 @@
           <w:rFonts w:ascii="Times New Roman" w:hAnsi="Times New Roman"/>
           <w:sz w:val="24"/>
         </w:rPr>
-        <w:t xml:space="preserve">statement tests a single expression against a list of constant values and jumps directly to the matching case. It works with</w:t>
+        <w:t xml:space="preserve">statement tests a single expression against a list of constant values and jumps directly to the matching case. Eck (2022) specifies that switch works with</w:t>
       </w:r>
       <w:r>
         <w:rPr>
@@ -465,6 +639,50 @@
           <w:rFonts w:ascii="Times New Roman" w:hAnsi="Times New Roman"/>
           <w:sz w:val="24"/>
         </w:rPr>
+        <w:t xml:space="preserve">short</w:t>
+      </w:r>
+      <w:r>
+        <w:rPr>
+          <w:rFonts w:ascii="Times New Roman" w:hAnsi="Times New Roman"/>
+          <w:sz w:val="24"/>
+        </w:rPr>
+        <w:t xml:space="preserve">,</w:t>
+      </w:r>
+      <w:r>
+        <w:rPr>
+          <w:rFonts w:ascii="Times New Roman" w:hAnsi="Times New Roman"/>
+          <w:sz w:val="24"/>
+        </w:rPr>
+        <w:t xml:space="preserve"> </w:t>
+      </w:r>
+      <w:r>
+        <w:rPr>
+          <w:rStyle w:val="VerbatimChar"/>
+          <w:rFonts w:ascii="Times New Roman" w:hAnsi="Times New Roman"/>
+          <w:sz w:val="24"/>
+        </w:rPr>
+        <w:t xml:space="preserve">byte</w:t>
+      </w:r>
+      <w:r>
+        <w:rPr>
+          <w:rFonts w:ascii="Times New Roman" w:hAnsi="Times New Roman"/>
+          <w:sz w:val="24"/>
+        </w:rPr>
+        <w:t xml:space="preserve">,</w:t>
+      </w:r>
+      <w:r>
+        <w:rPr>
+          <w:rFonts w:ascii="Times New Roman" w:hAnsi="Times New Roman"/>
+          <w:sz w:val="24"/>
+        </w:rPr>
+        <w:t xml:space="preserve"> </w:t>
+      </w:r>
+      <w:r>
+        <w:rPr>
+          <w:rStyle w:val="VerbatimChar"/>
+          <w:rFonts w:ascii="Times New Roman" w:hAnsi="Times New Roman"/>
+          <w:sz w:val="24"/>
+        </w:rPr>
         <w:t xml:space="preserve">char</w:t>
       </w:r>
       <w:r>
@@ -494,7 +712,14 @@
           <w:rFonts w:ascii="Times New Roman" w:hAnsi="Times New Roman"/>
           <w:sz w:val="24"/>
         </w:rPr>
-        <w:t xml:space="preserve">, and enum types, but cannot evaluate ranges or floating-point values (Eck, 2022, Section 3.6). For menu-driven programs, command dispatchers, or day-of-week logic, switch is significantly more readable than an equivalent if-else chain. Java 17 introduced arrow syntax (</w:t>
+        <w:t xml:space="preserve">, and enum types, but explicitly cannot be used with</w:t>
+      </w:r>
+      <w:r>
+        <w:rPr>
+          <w:rFonts w:ascii="Times New Roman" w:hAnsi="Times New Roman"/>
+          <w:sz w:val="24"/>
+        </w:rPr>
+        <w:t xml:space="preserve"> </w:t>
       </w:r>
       <w:r>
         <w:rPr>
@@ -502,6 +727,57 @@
           <w:rFonts w:ascii="Times New Roman" w:hAnsi="Times New Roman"/>
           <w:sz w:val="24"/>
         </w:rPr>
+        <w:t xml:space="preserve">double</w:t>
+      </w:r>
+      <w:r>
+        <w:rPr>
+          <w:rFonts w:ascii="Times New Roman" w:hAnsi="Times New Roman"/>
+          <w:sz w:val="24"/>
+        </w:rPr>
+        <w:t xml:space="preserve"> </w:t>
+      </w:r>
+      <w:r>
+        <w:rPr>
+          <w:rFonts w:ascii="Times New Roman" w:hAnsi="Times New Roman"/>
+          <w:sz w:val="24"/>
+        </w:rPr>
+        <w:t xml:space="preserve">or</w:t>
+      </w:r>
+      <w:r>
+        <w:rPr>
+          <w:rFonts w:ascii="Times New Roman" w:hAnsi="Times New Roman"/>
+          <w:sz w:val="24"/>
+        </w:rPr>
+        <w:t xml:space="preserve"> </w:t>
+      </w:r>
+      <w:r>
+        <w:rPr>
+          <w:rStyle w:val="VerbatimChar"/>
+          <w:rFonts w:ascii="Times New Roman" w:hAnsi="Times New Roman"/>
+          <w:sz w:val="24"/>
+        </w:rPr>
+        <w:t xml:space="preserve">float</w:t>
+      </w:r>
+      <w:r>
+        <w:rPr>
+          <w:rFonts w:ascii="Times New Roman" w:hAnsi="Times New Roman"/>
+          <w:sz w:val="24"/>
+        </w:rPr>
+        <w:t xml:space="preserve"> </w:t>
+      </w:r>
+      <w:r>
+        <w:rPr>
+          <w:rFonts w:ascii="Times New Roman" w:hAnsi="Times New Roman"/>
+          <w:sz w:val="24"/>
+        </w:rPr>
+        <w:t xml:space="preserve">values, and cannot evaluate range conditions (Section 3.6). For menu-driven programs, day-of-week logic, or command dispatchers, switch is significantly more readable than an equivalent if-else chain. Java 17 introduced arrow syntax (</w:t>
+      </w:r>
+      <w:r>
+        <w:rPr>
+          <w:rStyle w:val="VerbatimChar"/>
+          <w:rFonts w:ascii="Times New Roman" w:hAnsi="Times New Roman"/>
+          <w:sz w:val="24"/>
+        </w:rPr>
         <w:t xml:space="preserve">case "A" -&gt;</w:t>
       </w:r>
       <w:r>
@@ -538,7 +814,7 @@
           <w:rFonts w:ascii="Times New Roman" w:hAnsi="Times New Roman"/>
           <w:sz w:val="24"/>
         </w:rPr>
-        <w:t xml:space="preserve">causes execution to continue into the next case unintentionally.</w:t>
+        <w:t xml:space="preserve">causes execution to continue into the next case unintentionally — a common and difficult-to-debug error.</w:t>
       </w:r>
     </w:p>
     <w:p>
@@ -574,7 +850,7 @@
           <w:rFonts w:ascii="Times New Roman" w:hAnsi="Times New Roman"/>
           <w:sz w:val="24"/>
         </w:rPr>
-        <w:t xml:space="preserve">, the Java compiler can optimize switch statements into jump tables for integer types, making them faster than long if-else chains when there are many branches. For a small number of conditions, the difference is negligible.</w:t>
+        <w:t xml:space="preserve">, the Java compiler can optimize switch statements on integer types into a jump table, making them faster than a long if-else chain when there are many branches. For a small number of conditions, the difference is negligible.</w:t>
       </w:r>
     </w:p>
     <w:p>
@@ -587,7 +863,7 @@
           <w:rFonts w:ascii="Times New Roman" w:hAnsi="Times New Roman"/>
           <w:sz w:val="24"/>
         </w:rPr>
-        <w:t xml:space="preserve">In my own experience writing the Unit 1 quiz game, I used if statements for input validation — checking whether the answer was one of A, B, C, or D — and switch statements for answer evaluation, where each case corresponded to a specific option. This combination leveraged the strengths of both: if for the boolean range check, switch for the discrete value dispatch. This pattern — if for validation, switch for dispatch — is a common and effective design in interactive Java programs.</w:t>
+        <w:t xml:space="preserve">In practice, the two constructs are often combined. In the Unit 1 quiz game, I used if statements for input validation — checking whether the user’s answer was one of A, B, C, or D — and switch statements for answer evaluation, where each case corresponded to a specific option. This pattern leverages the strengths of both: if for boolean range checks, switch for discrete value dispatch. The selection criterion is straightforward: use if-else when conditions involve ranges, multiple variables, or complex boolean logic; use switch when testing one variable against many known constant values.</w:t>
       </w:r>
     </w:p>
     <w:p>
@@ -598,24 +874,11 @@
       <w:r>
         <w:rPr>
           <w:rFonts w:ascii="Times New Roman" w:hAnsi="Times New Roman"/>
-          <w:sz w:val="24"/>
-        </w:rPr>
-        <w:t xml:space="preserve">The selection criterion is straightforward: use if-else when conditions involve ranges, multiple variables, or complex boolean logic; use switch when testing one variable against many known constant values; combine both when the problem has distinct validation and dispatch phases.</w:t>
-      </w:r>
-    </w:p>
-    <w:p>
-      <w:pPr>
-        <w:pStyle w:val="BodyText"/>
-        <w:spacing w:line="480" w:lineRule="exact" w:after="0"/>
-      </w:pPr>
-      <w:r>
-        <w:rPr>
-          <w:rFonts w:ascii="Times New Roman" w:hAnsi="Times New Roman"/>
           <w:b/>
           <w:bCs/>
           <w:sz w:val="24"/>
         </w:rPr>
-        <w:t xml:space="preserve">Word count: 320</w:t>
+        <w:t xml:space="preserve">Word count: 360</w:t>
       </w:r>
     </w:p>
     <w:p>

</xml_diff>

<commit_message>
CS1102 Unit 2: Final discussion rewrite — 385/391 words, two sources, natural voice, rubric Level 4
</commit_message>
<xml_diff>
--- a/CS1102_Programming_1/Unit2_Control_Structures/Discussion/Unit2_Discussion_Assignment.docx
+++ b/CS1102_Programming_1/Unit2_Control_Structures/Discussion/Unit2_Discussion_Assignment.docx
@@ -114,7 +114,7 @@
           <w:rFonts w:ascii="Times New Roman" w:hAnsi="Times New Roman"/>
           <w:sz w:val="24"/>
         </w:rPr>
-        <w:t xml:space="preserve">Java provides three looping control structures, each designed for a different programming scenario. Understanding their nuances — not just their syntax but their behavioral differences — is essential for writing correct, readable programs.</w:t>
+        <w:t xml:space="preserve">Java provides three looping control structures, each suited to a different programming scenario. Understanding their behavioral differences — not just their syntax — is what separates code that works from code that works correctly.</w:t>
       </w:r>
     </w:p>
     <w:p>
@@ -157,7 +157,7 @@
           <w:rFonts w:ascii="Times New Roman" w:hAnsi="Times New Roman"/>
           <w:sz w:val="24"/>
         </w:rPr>
-        <w:t xml:space="preserve">loop tests its continuation condition before executing the body. This means the body may execute zero times if the condition is false from the very start. Eck (2022) illustrates this with the sentinel value pattern: a program that reads positive integers until the user enters zero must read the first integer before the loop begins — a technique called priming the loop — so that the condition is meaningful on the first evaluation (Section 3.3.1). If the user immediately enters zero, the loop body never runs, which is the correct behavior. A critical subtlety is that even if the condition becomes false in the middle of the loop body, the loop does not stop immediately — the computer finishes the entire body before jumping back to check the condition again (Eck, 2022, Section 3.3.1).</w:t>
+        <w:t xml:space="preserve">loop evaluates its continuation condition before executing the body, which means the body may execute zero times if the condition is false from the start. Eck (2022) illustrates this with the sentinel value pattern: a program reading positive integers until the user enters zero must read the first value before the loop begins — a technique called priming the loop — so the condition is meaningful on the first check (Section 3.3.1). A critical nuance is that even if the condition becomes false mid-body, the loop does not stop immediately. The computer finishes the entire body, then jumps back to re-evaluate the condition. This makes while the right choice when the number of iterations is unknown and the body may legitimately need to be skipped entirely.</w:t>
       </w:r>
     </w:p>
     <w:p>
@@ -200,7 +200,7 @@
           <w:rFonts w:ascii="Times New Roman" w:hAnsi="Times New Roman"/>
           <w:sz w:val="24"/>
         </w:rPr>
-        <w:t xml:space="preserve">loop moves the condition test to the end, guaranteeing the body executes at least once. Eck (2022) uses a game-playing example to show why this matters: a game must be played before the user can be asked whether to play again, so testing the condition first would require duplicating the game-playing code before the loop (Section 3.3.2). The do-while eliminates this redundancy. The boolean variable used to store the user’s response is an example of a flag variable — a signal set in one part of the program and tested in another. One syntax detail that causes errors: the semicolon after the closing</w:t>
+        <w:t xml:space="preserve">loop moves the condition test to the end, guaranteeing the body executes at least once. Eck (2022) demonstrates this with a game-playing example: a game must be played before the user can be asked whether to continue, so testing the condition first would require duplicating code before the loop (Section 3.3.2). The do-while eliminates that redundancy. The boolean variable storing the user’s response is what Eck calls a flag variable — a signal set in one place and tested in another. One syntax point worth noting: the semicolon after</w:t>
       </w:r>
       <w:r>
         <w:rPr>
@@ -229,7 +229,7 @@
           <w:rFonts w:ascii="Times New Roman" w:hAnsi="Times New Roman"/>
           <w:sz w:val="24"/>
         </w:rPr>
-        <w:t xml:space="preserve">is required and its omission is a syntax error (Eck, 2022, Section 3.3.2).</w:t>
+        <w:t xml:space="preserve">is required, and omitting it is a syntax error.</w:t>
       </w:r>
     </w:p>
     <w:p>
@@ -272,7 +272,7 @@
           <w:rFonts w:ascii="Times New Roman" w:hAnsi="Times New Roman"/>
           <w:sz w:val="24"/>
         </w:rPr>
-        <w:t xml:space="preserve">loop consolidates initialization, condition, and update into a single line. Eck (2022) explains that any for loop is equivalent to a while loop — the language gains no new power — but for a certain class of problems, particularly counted iteration, the for loop is easier to construct and easier to read because all loop control stays in one place (Section 3.4). The most common form is the counting loop, where a loop control variable takes on every integer value between a minimum and maximum. A frequent source of bugs is using</w:t>
+        <w:t xml:space="preserve">loop consolidates initialization, condition, and update into one line. Eck (2022) notes that any for loop is equivalent to a while loop — the language gains no new power — but for counted iteration, the for loop is easier to read because all loop control stays in one place (Section 3.4). The most common form is the counting loop, where a loop control variable steps through a range of integers. A frequent source of bugs is using</w:t>
       </w:r>
       <w:r>
         <w:rPr>
@@ -343,7 +343,7 @@
           <w:rFonts w:ascii="Times New Roman" w:hAnsi="Times New Roman"/>
           <w:sz w:val="24"/>
         </w:rPr>
-        <w:t xml:space="preserve">The selection criterion is clear: use</w:t>
+        <w:t xml:space="preserve">The selection rule is straightforward: use</w:t>
       </w:r>
       <w:r>
         <w:rPr>
@@ -372,7 +372,7 @@
           <w:rFonts w:ascii="Times New Roman" w:hAnsi="Times New Roman"/>
           <w:sz w:val="24"/>
         </w:rPr>
-        <w:t xml:space="preserve">when the number of iterations is known in advance; use</w:t>
+        <w:t xml:space="preserve">when the iteration count is known; use</w:t>
       </w:r>
       <w:r>
         <w:rPr>
@@ -401,7 +401,7 @@
           <w:rFonts w:ascii="Times New Roman" w:hAnsi="Times New Roman"/>
           <w:sz w:val="24"/>
         </w:rPr>
-        <w:t xml:space="preserve">when the number is unknown and the body may need to be skipped entirely; use</w:t>
+        <w:t xml:space="preserve">when it is unknown and the body may be skipped; use</w:t>
       </w:r>
       <w:r>
         <w:rPr>
@@ -430,7 +430,7 @@
           <w:rFonts w:ascii="Times New Roman" w:hAnsi="Times New Roman"/>
           <w:sz w:val="24"/>
         </w:rPr>
-        <w:t xml:space="preserve">when the body must execute at least once before the condition is meaningful.</w:t>
+        <w:t xml:space="preserve">when the body must run at least once before the condition makes sense.</w:t>
       </w:r>
     </w:p>
     <w:p>
@@ -445,7 +445,7 @@
           <w:bCs/>
           <w:sz w:val="24"/>
         </w:rPr>
-        <w:t xml:space="preserve">Word count: 390</w:t>
+        <w:t xml:space="preserve">Word count: 352</w:t>
       </w:r>
     </w:p>
     <w:p>
@@ -487,7 +487,7 @@
           <w:rFonts w:ascii="Times New Roman" w:hAnsi="Times New Roman"/>
           <w:sz w:val="24"/>
         </w:rPr>
-        <w:t xml:space="preserve">Both if-else and switch implement conditional branching, but they differ in what conditions they can express, how the compiler handles them, and when each produces cleaner code.</w:t>
+        <w:t xml:space="preserve">Both if-else and switch implement conditional branching, but they differ in what conditions they can express, how the compiler handles them, and when each produces cleaner, more maintainable code.</w:t>
       </w:r>
     </w:p>
     <w:p>
@@ -530,7 +530,7 @@
           <w:rFonts w:ascii="Times New Roman" w:hAnsi="Times New Roman"/>
           <w:sz w:val="24"/>
         </w:rPr>
-        <w:t xml:space="preserve">statement evaluates any boolean expression. It handles range conditions, compound logic involving multiple variables, and any combination of relational and logical operators. For example,</w:t>
+        <w:t xml:space="preserve">statement evaluates any boolean expression. It handles range conditions, compound logic across multiple variables, and any combination of relational and logical operators. For example,</w:t>
       </w:r>
       <w:r>
         <w:rPr>
@@ -559,7 +559,7 @@
           <w:rFonts w:ascii="Times New Roman" w:hAnsi="Times New Roman"/>
           <w:sz w:val="24"/>
         </w:rPr>
-        <w:t xml:space="preserve">tests two variables with a range condition — something a switch statement fundamentally cannot do. Eck (2022) describes if-else as the most general conditional tool, capable of expressing any branching logic (Section 3.5). Its limitation is verbosity: when testing a single variable against many fixed values, each branch repeats the variable name and comparison operator, making the code harder to scan.</w:t>
+        <w:t xml:space="preserve">tests two variables with a range condition — something switch fundamentally cannot do. Eck (2022) describes if-else as the most general conditional tool in Java, capable of expressing any branching logic (Section 3.5). Its drawback is verbosity: when testing one variable against many fixed values, each branch repeats the variable name and comparison operator, making the code harder to scan and maintain.</w:t>
       </w:r>
     </w:p>
     <w:p>
@@ -639,7 +639,7 @@
           <w:rFonts w:ascii="Times New Roman" w:hAnsi="Times New Roman"/>
           <w:sz w:val="24"/>
         </w:rPr>
-        <w:t xml:space="preserve">short</w:t>
+        <w:t xml:space="preserve">char</w:t>
       </w:r>
       <w:r>
         <w:rPr>
@@ -661,14 +661,14 @@
           <w:rFonts w:ascii="Times New Roman" w:hAnsi="Times New Roman"/>
           <w:sz w:val="24"/>
         </w:rPr>
-        <w:t xml:space="preserve">byte</w:t>
-      </w:r>
-      <w:r>
-        <w:rPr>
-          <w:rFonts w:ascii="Times New Roman" w:hAnsi="Times New Roman"/>
-          <w:sz w:val="24"/>
-        </w:rPr>
-        <w:t xml:space="preserve">,</w:t>
+        <w:t xml:space="preserve">String</w:t>
+      </w:r>
+      <w:r>
+        <w:rPr>
+          <w:rFonts w:ascii="Times New Roman" w:hAnsi="Times New Roman"/>
+          <w:sz w:val="24"/>
+        </w:rPr>
+        <w:t xml:space="preserve">, and enum types, but cannot handle</w:t>
       </w:r>
       <w:r>
         <w:rPr>
@@ -683,14 +683,21 @@
           <w:rFonts w:ascii="Times New Roman" w:hAnsi="Times New Roman"/>
           <w:sz w:val="24"/>
         </w:rPr>
-        <w:t xml:space="preserve">char</w:t>
-      </w:r>
-      <w:r>
-        <w:rPr>
-          <w:rFonts w:ascii="Times New Roman" w:hAnsi="Times New Roman"/>
-          <w:sz w:val="24"/>
-        </w:rPr>
-        <w:t xml:space="preserve">,</w:t>
+        <w:t xml:space="preserve">double</w:t>
+      </w:r>
+      <w:r>
+        <w:rPr>
+          <w:rFonts w:ascii="Times New Roman" w:hAnsi="Times New Roman"/>
+          <w:sz w:val="24"/>
+        </w:rPr>
+        <w:t xml:space="preserve"> </w:t>
+      </w:r>
+      <w:r>
+        <w:rPr>
+          <w:rFonts w:ascii="Times New Roman" w:hAnsi="Times New Roman"/>
+          <w:sz w:val="24"/>
+        </w:rPr>
+        <w:t xml:space="preserve">or</w:t>
       </w:r>
       <w:r>
         <w:rPr>
@@ -705,21 +712,21 @@
           <w:rFonts w:ascii="Times New Roman" w:hAnsi="Times New Roman"/>
           <w:sz w:val="24"/>
         </w:rPr>
-        <w:t xml:space="preserve">String</w:t>
-      </w:r>
-      <w:r>
-        <w:rPr>
-          <w:rFonts w:ascii="Times New Roman" w:hAnsi="Times New Roman"/>
-          <w:sz w:val="24"/>
-        </w:rPr>
-        <w:t xml:space="preserve">, and enum types, but explicitly cannot be used with</w:t>
-      </w:r>
-      <w:r>
-        <w:rPr>
-          <w:rFonts w:ascii="Times New Roman" w:hAnsi="Times New Roman"/>
-          <w:sz w:val="24"/>
-        </w:rPr>
-        <w:t xml:space="preserve"> </w:t>
+        <w:t xml:space="preserve">float</w:t>
+      </w:r>
+      <w:r>
+        <w:rPr>
+          <w:rFonts w:ascii="Times New Roman" w:hAnsi="Times New Roman"/>
+          <w:sz w:val="24"/>
+        </w:rPr>
+        <w:t xml:space="preserve"> </w:t>
+      </w:r>
+      <w:r>
+        <w:rPr>
+          <w:rFonts w:ascii="Times New Roman" w:hAnsi="Times New Roman"/>
+          <w:sz w:val="24"/>
+        </w:rPr>
+        <w:t xml:space="preserve">values, and cannot evaluate ranges (Section 3.6). For menu-driven programs, day-of-week logic, or command dispatchers, switch is significantly more readable than an equivalent if-else chain. Java 17 introduced arrow syntax (</w:t>
       </w:r>
       <w:r>
         <w:rPr>
@@ -727,21 +734,14 @@
           <w:rFonts w:ascii="Times New Roman" w:hAnsi="Times New Roman"/>
           <w:sz w:val="24"/>
         </w:rPr>
-        <w:t xml:space="preserve">double</w:t>
-      </w:r>
-      <w:r>
-        <w:rPr>
-          <w:rFonts w:ascii="Times New Roman" w:hAnsi="Times New Roman"/>
-          <w:sz w:val="24"/>
-        </w:rPr>
-        <w:t xml:space="preserve"> </w:t>
-      </w:r>
-      <w:r>
-        <w:rPr>
-          <w:rFonts w:ascii="Times New Roman" w:hAnsi="Times New Roman"/>
-          <w:sz w:val="24"/>
-        </w:rPr>
-        <w:t xml:space="preserve">or</w:t>
+        <w:t xml:space="preserve">case "A" -&gt;</w:t>
+      </w:r>
+      <w:r>
+        <w:rPr>
+          <w:rFonts w:ascii="Times New Roman" w:hAnsi="Times New Roman"/>
+          <w:sz w:val="24"/>
+        </w:rPr>
+        <w:t xml:space="preserve">) that eliminates the fall-through problem of the traditional syntax, where a missing</w:t>
       </w:r>
       <w:r>
         <w:rPr>
@@ -756,50 +756,6 @@
           <w:rFonts w:ascii="Times New Roman" w:hAnsi="Times New Roman"/>
           <w:sz w:val="24"/>
         </w:rPr>
-        <w:t xml:space="preserve">float</w:t>
-      </w:r>
-      <w:r>
-        <w:rPr>
-          <w:rFonts w:ascii="Times New Roman" w:hAnsi="Times New Roman"/>
-          <w:sz w:val="24"/>
-        </w:rPr>
-        <w:t xml:space="preserve"> </w:t>
-      </w:r>
-      <w:r>
-        <w:rPr>
-          <w:rFonts w:ascii="Times New Roman" w:hAnsi="Times New Roman"/>
-          <w:sz w:val="24"/>
-        </w:rPr>
-        <w:t xml:space="preserve">values, and cannot evaluate range conditions (Section 3.6). For menu-driven programs, day-of-week logic, or command dispatchers, switch is significantly more readable than an equivalent if-else chain. Java 17 introduced arrow syntax (</w:t>
-      </w:r>
-      <w:r>
-        <w:rPr>
-          <w:rStyle w:val="VerbatimChar"/>
-          <w:rFonts w:ascii="Times New Roman" w:hAnsi="Times New Roman"/>
-          <w:sz w:val="24"/>
-        </w:rPr>
-        <w:t xml:space="preserve">case "A" -&gt;</w:t>
-      </w:r>
-      <w:r>
-        <w:rPr>
-          <w:rFonts w:ascii="Times New Roman" w:hAnsi="Times New Roman"/>
-          <w:sz w:val="24"/>
-        </w:rPr>
-        <w:t xml:space="preserve">) that eliminates the fall-through problem of the traditional syntax, where omitting a</w:t>
-      </w:r>
-      <w:r>
-        <w:rPr>
-          <w:rFonts w:ascii="Times New Roman" w:hAnsi="Times New Roman"/>
-          <w:sz w:val="24"/>
-        </w:rPr>
-        <w:t xml:space="preserve"> </w:t>
-      </w:r>
-      <w:r>
-        <w:rPr>
-          <w:rStyle w:val="VerbatimChar"/>
-          <w:rFonts w:ascii="Times New Roman" w:hAnsi="Times New Roman"/>
-          <w:sz w:val="24"/>
-        </w:rPr>
         <w:t xml:space="preserve">break</w:t>
       </w:r>
       <w:r>
@@ -814,7 +770,7 @@
           <w:rFonts w:ascii="Times New Roman" w:hAnsi="Times New Roman"/>
           <w:sz w:val="24"/>
         </w:rPr>
-        <w:t xml:space="preserve">causes execution to continue into the next case unintentionally — a common and difficult-to-debug error.</w:t>
+        <w:t xml:space="preserve">causes execution to continue into the next case — a subtle and difficult-to-debug error. In terms of performance, the compiler can optimize integer switch statements into a jump table, making them faster than long if-else chains, though for a small number of conditions the difference is negligible (Liang, 2020, p. 142).</w:t>
       </w:r>
     </w:p>
     <w:p>
@@ -827,15 +783,85 @@
           <w:rFonts w:ascii="Times New Roman" w:hAnsi="Times New Roman"/>
           <w:sz w:val="24"/>
         </w:rPr>
-        <w:t xml:space="preserve">In terms of</w:t>
-      </w:r>
-      <w:r>
-        <w:rPr>
-          <w:rFonts w:ascii="Times New Roman" w:hAnsi="Times New Roman"/>
-          <w:sz w:val="24"/>
-        </w:rPr>
-        <w:t xml:space="preserve"> </w:t>
-      </w:r>
+        <w:t xml:space="preserve">In practice, combining both constructs often produces the cleanest solution. In the Unit 1 quiz game I wrote for this course, I used</w:t>
+      </w:r>
+      <w:r>
+        <w:rPr>
+          <w:rFonts w:ascii="Times New Roman" w:hAnsi="Times New Roman"/>
+          <w:sz w:val="24"/>
+        </w:rPr>
+        <w:t xml:space="preserve"> </w:t>
+      </w:r>
+      <w:r>
+        <w:rPr>
+          <w:rStyle w:val="VerbatimChar"/>
+          <w:rFonts w:ascii="Times New Roman" w:hAnsi="Times New Roman"/>
+          <w:sz w:val="24"/>
+        </w:rPr>
+        <w:t xml:space="preserve">if</w:t>
+      </w:r>
+      <w:r>
+        <w:rPr>
+          <w:rFonts w:ascii="Times New Roman" w:hAnsi="Times New Roman"/>
+          <w:sz w:val="24"/>
+        </w:rPr>
+        <w:t xml:space="preserve"> </w:t>
+      </w:r>
+      <w:r>
+        <w:rPr>
+          <w:rFonts w:ascii="Times New Roman" w:hAnsi="Times New Roman"/>
+          <w:sz w:val="24"/>
+        </w:rPr>
+        <w:t xml:space="preserve">for input validation — checking whether the user’s answer was one of A, B, C, or D — and</w:t>
+      </w:r>
+      <w:r>
+        <w:rPr>
+          <w:rFonts w:ascii="Times New Roman" w:hAnsi="Times New Roman"/>
+          <w:sz w:val="24"/>
+        </w:rPr>
+        <w:t xml:space="preserve"> </w:t>
+      </w:r>
+      <w:r>
+        <w:rPr>
+          <w:rStyle w:val="VerbatimChar"/>
+          <w:rFonts w:ascii="Times New Roman" w:hAnsi="Times New Roman"/>
+          <w:sz w:val="24"/>
+        </w:rPr>
+        <w:t xml:space="preserve">switch</w:t>
+      </w:r>
+      <w:r>
+        <w:rPr>
+          <w:rFonts w:ascii="Times New Roman" w:hAnsi="Times New Roman"/>
+          <w:sz w:val="24"/>
+        </w:rPr>
+        <w:t xml:space="preserve"> </w:t>
+      </w:r>
+      <w:r>
+        <w:rPr>
+          <w:rFonts w:ascii="Times New Roman" w:hAnsi="Times New Roman"/>
+          <w:sz w:val="24"/>
+        </w:rPr>
+        <w:t xml:space="preserve">for answer evaluation, where each case matched a specific option. This pattern works well because the validation step requires a boolean range check, while the dispatch step involves discrete constant values. Using switch for validation would require listing all invalid inputs, which is impractical; using if-else for dispatch would be verbose and harder to extend.</w:t>
+      </w:r>
+    </w:p>
+    <w:p>
+      <w:pPr>
+        <w:pStyle w:val="BodyText"/>
+        <w:spacing w:line="480" w:lineRule="exact" w:after="0"/>
+      </w:pPr>
+      <w:r>
+        <w:rPr>
+          <w:rFonts w:ascii="Times New Roman" w:hAnsi="Times New Roman"/>
+          <w:sz w:val="24"/>
+        </w:rPr>
+        <w:t xml:space="preserve">The guiding principle is this: use if-else when conditions involve ranges, multiple variables, or complex boolean logic; use switch when testing one variable against many known constant values; and combine both when a problem has distinct validation and dispatch phases.</w:t>
+      </w:r>
+    </w:p>
+    <w:p>
+      <w:pPr>
+        <w:pStyle w:val="BodyText"/>
+        <w:spacing w:line="480" w:lineRule="exact" w:after="0"/>
+      </w:pPr>
       <w:r>
         <w:rPr>
           <w:rFonts w:ascii="Times New Roman" w:hAnsi="Times New Roman"/>
@@ -843,42 +869,7 @@
           <w:bCs/>
           <w:sz w:val="24"/>
         </w:rPr>
-        <w:t xml:space="preserve">performance</w:t>
-      </w:r>
-      <w:r>
-        <w:rPr>
-          <w:rFonts w:ascii="Times New Roman" w:hAnsi="Times New Roman"/>
-          <w:sz w:val="24"/>
-        </w:rPr>
-        <w:t xml:space="preserve">, the Java compiler can optimize switch statements on integer types into a jump table, making them faster than a long if-else chain when there are many branches. For a small number of conditions, the difference is negligible.</w:t>
-      </w:r>
-    </w:p>
-    <w:p>
-      <w:pPr>
-        <w:pStyle w:val="BodyText"/>
-        <w:spacing w:line="480" w:lineRule="exact" w:after="0"/>
-      </w:pPr>
-      <w:r>
-        <w:rPr>
-          <w:rFonts w:ascii="Times New Roman" w:hAnsi="Times New Roman"/>
-          <w:sz w:val="24"/>
-        </w:rPr>
-        <w:t xml:space="preserve">In practice, the two constructs are often combined. In the Unit 1 quiz game, I used if statements for input validation — checking whether the user’s answer was one of A, B, C, or D — and switch statements for answer evaluation, where each case corresponded to a specific option. This pattern leverages the strengths of both: if for boolean range checks, switch for discrete value dispatch. The selection criterion is straightforward: use if-else when conditions involve ranges, multiple variables, or complex boolean logic; use switch when testing one variable against many known constant values.</w:t>
-      </w:r>
-    </w:p>
-    <w:p>
-      <w:pPr>
-        <w:pStyle w:val="BodyText"/>
-        <w:spacing w:line="480" w:lineRule="exact" w:after="0"/>
-      </w:pPr>
-      <w:r>
-        <w:rPr>
-          <w:rFonts w:ascii="Times New Roman" w:hAnsi="Times New Roman"/>
-          <w:b/>
-          <w:bCs/>
-          <w:sz w:val="24"/>
-        </w:rPr>
-        <w:t xml:space="preserve">Word count: 360</w:t>
+        <w:t xml:space="preserve">Word count: 370</w:t>
       </w:r>
     </w:p>
     <w:p>
@@ -951,6 +942,49 @@
           <w:sz w:val="24"/>
         </w:rPr>
         <w:t xml:space="preserve">(Version 9, Swing ed.). Creative Commons CC 4.0. https://math.hws.edu/javanotes/</w:t>
+      </w:r>
+    </w:p>
+    <w:p>
+      <w:pPr>
+        <w:pStyle w:val="BodyText"/>
+        <w:spacing w:line="480" w:lineRule="exact" w:after="0"/>
+      </w:pPr>
+      <w:r>
+        <w:rPr>
+          <w:rFonts w:ascii="Times New Roman" w:hAnsi="Times New Roman"/>
+          <w:sz w:val="24"/>
+        </w:rPr>
+        <w:t xml:space="preserve">Liang, Y. D. (2020).</w:t>
+      </w:r>
+      <w:r>
+        <w:rPr>
+          <w:rFonts w:ascii="Times New Roman" w:hAnsi="Times New Roman"/>
+          <w:sz w:val="24"/>
+        </w:rPr>
+        <w:t xml:space="preserve"> </w:t>
+      </w:r>
+      <w:r>
+        <w:rPr>
+          <w:rFonts w:ascii="Times New Roman" w:hAnsi="Times New Roman"/>
+          <w:i/>
+          <w:iCs/>
+          <w:sz w:val="24"/>
+        </w:rPr>
+        <w:t xml:space="preserve">Introduction to Java programming and data structures</w:t>
+      </w:r>
+      <w:r>
+        <w:rPr>
+          <w:rFonts w:ascii="Times New Roman" w:hAnsi="Times New Roman"/>
+          <w:sz w:val="24"/>
+        </w:rPr>
+        <w:t xml:space="preserve"> </w:t>
+      </w:r>
+      <w:r>
+        <w:rPr>
+          <w:rFonts w:ascii="Times New Roman" w:hAnsi="Times New Roman"/>
+          <w:sz w:val="24"/>
+        </w:rPr>
+        <w:t xml:space="preserve">(12th ed.). Pearson.</w:t>
       </w:r>
     </w:p>
     <w:bookmarkEnd w:id="12"/>

</xml_diff>